<commit_message>
Renumber Gearhaven from Session 8 to Session 7 (DM ruling 2026-07-06)
The chronicle now reads 1-7 continuously with no gap (supersedes the
earlier keep-it-as-8 call). Renamed session_08_gearhaven.docx ->
session_07_gearhaven.docx and edited its internal title; future planned
sessions shift down one (reunion=8, finale=14). Updated foreword,
session_06 teaser, canon, session_log, house_rules, CLAUDE.md,
session_template, README, publish.py. Root PDF is now
09_Session_7_Gearhaven_the_Clockwork_City.pdf; foreword PDF refreshed.
Asset folder assets/session_08/ keeps its internal name (not reader-facing).

Co-Authored-By: Claude Opus 4.8 <noreply@anthropic.com>
</commit_message>
<xml_diff>
--- a/frontmatter/foreword.docx
+++ b/frontmatter/foreword.docx
@@ -648,7 +648,7 @@
           <w:color w:val="222222"/>
           <w:sz w:val="21"/>
         </w:rPr>
-        <w:t>Eight. Gearhaven, the Clockwork City.</w:t>
+        <w:t>Seven. Gearhaven, the Clockwork City.</w:t>
       </w:r>
       <w:r>
         <w:rPr>
@@ -659,26 +659,6 @@
           <w:sz w:val="21"/>
         </w:rPr>
         <w:t xml:space="preserve"> In the great city of inventors the Sphere reveals its purpose, the stars are found to be going dark one by one, and a gentle giant is freed. Then the heroes part for a year, and this chronicle pauses, to be continued.</w:t>
-      </w:r>
-    </w:p>
-    <w:p>
-      <w:pPr>
-        <w:pBdr>
-          <w:left w:val="single" w:sz="18" w:space="12" w:color="5B2A86"/>
-        </w:pBdr>
-        <w:shd w:val="clear" w:color="auto" w:fill="F4F0FA"/>
-        <w:spacing w:before="30" w:after="70"/>
-        <w:ind w:left="340" w:right="340"/>
-      </w:pPr>
-      <w:r>
-        <w:rPr>
-          <w:rFonts w:ascii="Georgia" w:hAnsi="Georgia" w:cs="Georgia"/>
-          <w:b w:val="0"/>
-          <w:i w:val="0"/>
-          <w:color w:val="222222"/>
-          <w:sz w:val="19"/>
-        </w:rPr>
-        <w:t>▶ There was no seventh session at the table; the Wraithpine arc was the sixth, and Gearhaven kept its number. The chapters read straight through regardless.</w:t>
       </w:r>
     </w:p>
     <w:sectPr>

</xml_diff>

<commit_message>
Foreword: v3 sheet portraits + at-the-table spell slot lines per hero
Co-Authored-By: Claude Opus 4.8 <noreply@anthropic.com>
</commit_message>
<xml_diff>
--- a/frontmatter/foreword.docx
+++ b/frontmatter/foreword.docx
@@ -346,6 +346,46 @@
     </w:p>
     <w:p>
       <w:pPr>
+        <w:pBdr>
+          <w:left w:val="single" w:sz="18" w:space="12" w:color="5B2A86"/>
+        </w:pBdr>
+        <w:shd w:val="clear" w:color="auto" w:fill="F4F0FA"/>
+        <w:spacing w:before="30" w:after="70"/>
+        <w:ind w:left="340" w:right="340"/>
+      </w:pPr>
+      <w:r>
+        <w:rPr>
+          <w:rFonts w:ascii="Georgia" w:hAnsi="Georgia" w:cs="Georgia"/>
+          <w:b w:val="0"/>
+          <w:i w:val="0"/>
+          <w:color w:val="222222"/>
+          <w:sz w:val="19"/>
+        </w:rPr>
+        <w:t xml:space="preserve">▶ </w:t>
+      </w:r>
+      <w:r>
+        <w:rPr>
+          <w:rFonts w:ascii="Georgia" w:hAnsi="Georgia" w:cs="Georgia"/>
+          <w:b/>
+          <w:i w:val="0"/>
+          <w:color w:val="222222"/>
+          <w:sz w:val="19"/>
+        </w:rPr>
+        <w:t>At the table:</w:t>
+      </w:r>
+      <w:r>
+        <w:rPr>
+          <w:rFonts w:ascii="Georgia" w:hAnsi="Georgia" w:cs="Georgia"/>
+          <w:b w:val="0"/>
+          <w:i w:val="0"/>
+          <w:color w:val="222222"/>
+          <w:sz w:val="19"/>
+        </w:rPr>
+        <w:t xml:space="preserve"> Level 5 Artificer. Spell slots: four 1st, two 2nd. Her Eldritch Cannon deploys free via the Pocket Dynamo and runs all day.</w:t>
+      </w:r>
+    </w:p>
+    <w:p>
+      <w:pPr>
         <w:keepNext/>
         <w:spacing w:before="120" w:after="40"/>
         <w:jc w:val="center"/>
@@ -554,6 +594,46 @@
           <w:sz w:val="21"/>
         </w:rPr>
         <w:t xml:space="preserve"> of the Circle of the Eternal Stars, he carries three enchanted potatoes and a great many questions, and a dragonmark that stirs whenever something frightened and voiceless needs him.</w:t>
+      </w:r>
+    </w:p>
+    <w:p>
+      <w:pPr>
+        <w:pBdr>
+          <w:left w:val="single" w:sz="18" w:space="12" w:color="5B2A86"/>
+        </w:pBdr>
+        <w:shd w:val="clear" w:color="auto" w:fill="F4F0FA"/>
+        <w:spacing w:before="30" w:after="70"/>
+        <w:ind w:left="340" w:right="340"/>
+      </w:pPr>
+      <w:r>
+        <w:rPr>
+          <w:rFonts w:ascii="Georgia" w:hAnsi="Georgia" w:cs="Georgia"/>
+          <w:b w:val="0"/>
+          <w:i w:val="0"/>
+          <w:color w:val="222222"/>
+          <w:sz w:val="19"/>
+        </w:rPr>
+        <w:t xml:space="preserve">▶ </w:t>
+      </w:r>
+      <w:r>
+        <w:rPr>
+          <w:rFonts w:ascii="Georgia" w:hAnsi="Georgia" w:cs="Georgia"/>
+          <w:b/>
+          <w:i w:val="0"/>
+          <w:color w:val="222222"/>
+          <w:sz w:val="19"/>
+        </w:rPr>
+        <w:t>At the table:</w:t>
+      </w:r>
+      <w:r>
+        <w:rPr>
+          <w:rFonts w:ascii="Georgia" w:hAnsi="Georgia" w:cs="Georgia"/>
+          <w:b w:val="0"/>
+          <w:i w:val="0"/>
+          <w:color w:val="222222"/>
+          <w:sz w:val="19"/>
+        </w:rPr>
+        <w:t xml:space="preserve"> Level 5 Druid. Spell slots: four 1st, three 2nd, two 3rd, plus about eight free Guiding Bolts a day from the Star Map and the Staff's charges.</w:t>
       </w:r>
     </w:p>
     <w:p>

</xml_diff>

<commit_message>
Foreword: Stabby focus-points line
Co-Authored-By: Claude Opus 4.8 <noreply@anthropic.com>
</commit_message>
<xml_diff>
--- a/frontmatter/foreword.docx
+++ b/frontmatter/foreword.docx
@@ -548,6 +548,66 @@
     </w:p>
     <w:p>
       <w:pPr>
+        <w:pBdr>
+          <w:left w:val="single" w:sz="18" w:space="12" w:color="5B2A86"/>
+        </w:pBdr>
+        <w:shd w:val="clear" w:color="auto" w:fill="F4F0FA"/>
+        <w:spacing w:before="30" w:after="70"/>
+        <w:ind w:left="340" w:right="340"/>
+      </w:pPr>
+      <w:r>
+        <w:rPr>
+          <w:rFonts w:ascii="Georgia" w:hAnsi="Georgia" w:cs="Georgia"/>
+          <w:b w:val="0"/>
+          <w:i w:val="0"/>
+          <w:color w:val="222222"/>
+          <w:sz w:val="19"/>
+        </w:rPr>
+        <w:t xml:space="preserve">▶ </w:t>
+      </w:r>
+      <w:r>
+        <w:rPr>
+          <w:rFonts w:ascii="Georgia" w:hAnsi="Georgia" w:cs="Georgia"/>
+          <w:b/>
+          <w:i w:val="0"/>
+          <w:color w:val="222222"/>
+          <w:sz w:val="19"/>
+        </w:rPr>
+        <w:t>At the table:</w:t>
+      </w:r>
+      <w:r>
+        <w:rPr>
+          <w:rFonts w:ascii="Georgia" w:hAnsi="Georgia" w:cs="Georgia"/>
+          <w:b w:val="0"/>
+          <w:i w:val="0"/>
+          <w:color w:val="222222"/>
+          <w:sz w:val="19"/>
+        </w:rPr>
+        <w:t xml:space="preserve"> Level 5 Monk. No spell slots; he runs on </w:t>
+      </w:r>
+      <w:r>
+        <w:rPr>
+          <w:rFonts w:ascii="Georgia" w:hAnsi="Georgia" w:cs="Georgia"/>
+          <w:b/>
+          <w:i w:val="0"/>
+          <w:color w:val="222222"/>
+          <w:sz w:val="19"/>
+        </w:rPr>
+        <w:t>5 Focus Points</w:t>
+      </w:r>
+      <w:r>
+        <w:rPr>
+          <w:rFonts w:ascii="Georgia" w:hAnsi="Georgia" w:cs="Georgia"/>
+          <w:b w:val="0"/>
+          <w:i w:val="0"/>
+          <w:color w:val="222222"/>
+          <w:sz w:val="19"/>
+        </w:rPr>
+        <w:t xml:space="preserve"> per short rest (Flurry of Blows, Stunning Strike, Patient Defense, Step of the Wind).</w:t>
+      </w:r>
+    </w:p>
+    <w:p>
+      <w:pPr>
         <w:keepNext/>
         <w:spacing w:before="220" w:after="60"/>
       </w:pPr>

</xml_diff>

<commit_message>
Publishable-book pass: parchment page background, safe bottom margin, slot pips
- Book-wide parchment paper color (F9F2E2), verified in PDF export
- Bottom margin 0.75in -> 0.9in so content never rides the page edge
- Foreword hero lines now show spell slots as visual pips
- Full republish of all 10 PDFs

Co-Authored-By: Claude Opus 4.8 <noreply@anthropic.com>
</commit_message>
<xml_diff>
--- a/frontmatter/foreword.docx
+++ b/frontmatter/foreword.docx
@@ -1,6 +1,7 @@
 
 <file path=word/document.xml><?xml version="1.0" encoding="utf-8"?>
 <w:document xmlns:wpc="http://schemas.microsoft.com/office/word/2010/wordprocessingCanvas" xmlns:mo="http://schemas.microsoft.com/office/mac/office/2008/main" xmlns:mc="http://schemas.openxmlformats.org/markup-compatibility/2006" xmlns:mv="urn:schemas-microsoft-com:mac:vml" xmlns:o="urn:schemas-microsoft-com:office:office" xmlns:r="http://schemas.openxmlformats.org/officeDocument/2006/relationships" xmlns:m="http://schemas.openxmlformats.org/officeDocument/2006/math" xmlns:v="urn:schemas-microsoft-com:vml" xmlns:wp14="http://schemas.microsoft.com/office/word/2010/wordprocessingDrawing" xmlns:wp="http://schemas.openxmlformats.org/drawingml/2006/wordprocessingDrawing" xmlns:w10="urn:schemas-microsoft-com:office:word" xmlns:w="http://schemas.openxmlformats.org/wordprocessingml/2006/main" xmlns:w14="http://schemas.microsoft.com/office/word/2010/wordml" xmlns:wpg="http://schemas.microsoft.com/office/word/2010/wordprocessingGroup" xmlns:wpi="http://schemas.microsoft.com/office/word/2010/wordprocessingInk" xmlns:wne="http://schemas.microsoft.com/office/word/2006/wordml" xmlns:wps="http://schemas.microsoft.com/office/word/2010/wordprocessingShape" mc:Ignorable="w14 wp14">
+  <w:background w:color="F9F2E2"/>
   <w:body>
     <w:p>
       <w:pPr>
@@ -381,7 +382,27 @@
           <w:color w:val="222222"/>
           <w:sz w:val="19"/>
         </w:rPr>
-        <w:t xml:space="preserve"> Level 5 Artificer. Spell slots: four 1st, two 2nd. Her Eldritch Cannon deploys free via the Pocket Dynamo and runs all day.</w:t>
+        <w:t xml:space="preserve"> Level 5 Artificer. Spell slots: </w:t>
+      </w:r>
+      <w:r>
+        <w:rPr>
+          <w:rFonts w:ascii="Georgia" w:hAnsi="Georgia" w:cs="Georgia"/>
+          <w:b/>
+          <w:i w:val="0"/>
+          <w:color w:val="222222"/>
+          <w:sz w:val="19"/>
+        </w:rPr>
+        <w:t>1st ● ● ● ●   2nd ● ●</w:t>
+      </w:r>
+      <w:r>
+        <w:rPr>
+          <w:rFonts w:ascii="Georgia" w:hAnsi="Georgia" w:cs="Georgia"/>
+          <w:b w:val="0"/>
+          <w:i w:val="0"/>
+          <w:color w:val="222222"/>
+          <w:sz w:val="19"/>
+        </w:rPr>
+        <w:t>. Her Eldritch Cannon deploys free via the Pocket Dynamo and runs all day.</w:t>
       </w:r>
     </w:p>
     <w:p>
@@ -593,7 +614,7 @@
           <w:color w:val="222222"/>
           <w:sz w:val="19"/>
         </w:rPr>
-        <w:t>5 Focus Points</w:t>
+        <w:t>Focus ● ● ● ● ●</w:t>
       </w:r>
       <w:r>
         <w:rPr>
@@ -693,7 +714,27 @@
           <w:color w:val="222222"/>
           <w:sz w:val="19"/>
         </w:rPr>
-        <w:t xml:space="preserve"> Level 5 Druid. Spell slots: four 1st, three 2nd, two 3rd, plus about eight free Guiding Bolts a day from the Star Map and the Staff's charges.</w:t>
+        <w:t xml:space="preserve"> Level 5 Druid. Spell slots: </w:t>
+      </w:r>
+      <w:r>
+        <w:rPr>
+          <w:rFonts w:ascii="Georgia" w:hAnsi="Georgia" w:cs="Georgia"/>
+          <w:b/>
+          <w:i w:val="0"/>
+          <w:color w:val="222222"/>
+          <w:sz w:val="19"/>
+        </w:rPr>
+        <w:t>1st ● ● ● ●   2nd ● ● ●   3rd ● ●</w:t>
+      </w:r>
+      <w:r>
+        <w:rPr>
+          <w:rFonts w:ascii="Georgia" w:hAnsi="Georgia" w:cs="Georgia"/>
+          <w:b w:val="0"/>
+          <w:i w:val="0"/>
+          <w:color w:val="222222"/>
+          <w:sz w:val="19"/>
+        </w:rPr>
+        <w:t>, plus about eight free Guiding Bolts a day from the Star Map and the Staff's charges.</w:t>
       </w:r>
     </w:p>
     <w:p>
@@ -1084,7 +1125,7 @@
     <w:sectPr>
       <w:footerReference w:type="default" r:id="rId9"/>
       <w:pgSz w:w="12240" w:h="15840"/>
-      <w:pgMar w:top="1080" w:right="1440" w:bottom="1080" w:left="1440" w:header="720" w:footer="720" w:gutter="0"/>
+      <w:pgMar w:top="1080" w:right="1440" w:bottom="1300" w:left="1440" w:header="720" w:footer="720" w:gutter="0"/>
       <w:cols w:space="720"/>
       <w:docGrid w:linePitch="360"/>
     </w:sectPr>

</xml_diff>

<commit_message>
Engine: float text-gaps, imgrow, melody blocks; foreword pairs Ursa+Ghostbloom with labels
Co-Authored-By: Claude Opus 4.8 <noreply@anthropic.com>
</commit_message>
<xml_diff>
--- a/frontmatter/foreword.docx
+++ b/frontmatter/foreword.docx
@@ -740,62 +740,6 @@
     <w:p>
       <w:pPr>
         <w:keepNext/>
-        <w:spacing w:before="120" w:after="40"/>
-        <w:jc w:val="center"/>
-      </w:pPr>
-      <w:r>
-        <w:drawing>
-          <wp:inline xmlns:a="http://schemas.openxmlformats.org/drawingml/2006/main" xmlns:pic="http://schemas.openxmlformats.org/drawingml/2006/picture">
-            <wp:extent cx="2560320" cy="2560320"/>
-            <wp:docPr id="4" name="Picture 4"/>
-            <wp:cNvGraphicFramePr>
-              <a:graphicFrameLocks noChangeAspect="1"/>
-            </wp:cNvGraphicFramePr>
-            <a:graphic>
-              <a:graphicData uri="http://schemas.openxmlformats.org/drawingml/2006/picture">
-                <pic:pic>
-                  <pic:nvPicPr>
-                    <pic:cNvPr id="0" name="image.jpg"/>
-                    <pic:cNvPicPr/>
-                  </pic:nvPicPr>
-                  <pic:blipFill>
-                    <a:blip r:embed="rId13"/>
-                    <a:stretch>
-                      <a:fillRect/>
-                    </a:stretch>
-                  </pic:blipFill>
-                  <pic:spPr>
-                    <a:xfrm>
-                      <a:off x="0" y="0"/>
-                      <a:ext cx="2560320" cy="2560320"/>
-                    </a:xfrm>
-                    <a:prstGeom prst="rect"/>
-                  </pic:spPr>
-                </pic:pic>
-              </a:graphicData>
-            </a:graphic>
-          </wp:inline>
-        </w:drawing>
-      </w:r>
-    </w:p>
-    <w:p>
-      <w:pPr>
-        <w:spacing w:after="140"/>
-        <w:jc w:val="center"/>
-      </w:pPr>
-      <w:r>
-        <w:rPr>
-          <w:rFonts w:ascii="Georgia" w:hAnsi="Georgia" w:cs="Georgia"/>
-          <w:i/>
-          <w:color w:val="888888"/>
-          <w:sz w:val="18"/>
-        </w:rPr>
-        <w:t>Ursa Catchum with an enchanted potato.</w:t>
-      </w:r>
-    </w:p>
-    <w:p>
-      <w:pPr>
-        <w:keepNext/>
         <w:spacing w:before="220" w:after="60"/>
       </w:pPr>
       <w:r>
@@ -823,61 +767,152 @@
         <w:t>Their companion: once the little plant-sprite Floraburst, now a spirit of pale teal ghost-light who chimes like frost and glows toward trouble. Some say she is the sleeping goddess's own small voice, sent to walk beside her chosen.</w:t>
       </w:r>
     </w:p>
+    <w:tbl>
+      <w:tblPr>
+        <w:tblW w:type="auto" w:w="0"/>
+        <w:jc w:val="center"/>
+        <w:tblLayout w:type="fixed"/>
+        <w:tblLook w:firstColumn="1" w:firstRow="1" w:lastColumn="0" w:lastRow="0" w:noHBand="0" w:noVBand="1" w:val="04A0"/>
+      </w:tblPr>
+      <w:tblGrid>
+        <w:gridCol w:w="4680"/>
+        <w:gridCol w:w="4680"/>
+      </w:tblGrid>
+      <w:tr>
+        <w:tc>
+          <w:tcPr>
+            <w:tcW w:type="dxa" w:w="4680"/>
+          </w:tcPr>
+          <w:p>
+            <w:pPr>
+              <w:jc w:val="center"/>
+            </w:pPr>
+            <w:r>
+              <w:drawing>
+                <wp:inline xmlns:a="http://schemas.openxmlformats.org/drawingml/2006/main" xmlns:pic="http://schemas.openxmlformats.org/drawingml/2006/picture">
+                  <wp:extent cx="2651760" cy="2651760"/>
+                  <wp:docPr id="4" name="Picture 4"/>
+                  <wp:cNvGraphicFramePr>
+                    <a:graphicFrameLocks noChangeAspect="1"/>
+                  </wp:cNvGraphicFramePr>
+                  <a:graphic>
+                    <a:graphicData uri="http://schemas.openxmlformats.org/drawingml/2006/picture">
+                      <pic:pic>
+                        <pic:nvPicPr>
+                          <pic:cNvPr id="0" name="image.jpg"/>
+                          <pic:cNvPicPr/>
+                        </pic:nvPicPr>
+                        <pic:blipFill>
+                          <a:blip r:embed="rId13"/>
+                          <a:stretch>
+                            <a:fillRect/>
+                          </a:stretch>
+                        </pic:blipFill>
+                        <pic:spPr>
+                          <a:xfrm>
+                            <a:off x="0" y="0"/>
+                            <a:ext cx="2651760" cy="2651760"/>
+                          </a:xfrm>
+                          <a:prstGeom prst="rect"/>
+                        </pic:spPr>
+                      </pic:pic>
+                    </a:graphicData>
+                  </a:graphic>
+                </wp:inline>
+              </w:drawing>
+            </w:r>
+          </w:p>
+        </w:tc>
+        <w:tc>
+          <w:tcPr>
+            <w:tcW w:type="dxa" w:w="4680"/>
+          </w:tcPr>
+          <w:p>
+            <w:pPr>
+              <w:jc w:val="center"/>
+            </w:pPr>
+            <w:r>
+              <w:drawing>
+                <wp:inline xmlns:a="http://schemas.openxmlformats.org/drawingml/2006/main" xmlns:pic="http://schemas.openxmlformats.org/drawingml/2006/picture">
+                  <wp:extent cx="2194560" cy="3291840"/>
+                  <wp:docPr id="5" name="Picture 5"/>
+                  <wp:cNvGraphicFramePr>
+                    <a:graphicFrameLocks noChangeAspect="1"/>
+                  </wp:cNvGraphicFramePr>
+                  <a:graphic>
+                    <a:graphicData uri="http://schemas.openxmlformats.org/drawingml/2006/picture">
+                      <pic:pic>
+                        <pic:nvPicPr>
+                          <pic:cNvPr id="0" name="image.jpg"/>
+                          <pic:cNvPicPr/>
+                        </pic:nvPicPr>
+                        <pic:blipFill>
+                          <a:blip r:embed="rId14"/>
+                          <a:stretch>
+                            <a:fillRect/>
+                          </a:stretch>
+                        </pic:blipFill>
+                        <pic:spPr>
+                          <a:xfrm>
+                            <a:off x="0" y="0"/>
+                            <a:ext cx="2194560" cy="3291840"/>
+                          </a:xfrm>
+                          <a:prstGeom prst="rect"/>
+                        </pic:spPr>
+                      </pic:pic>
+                    </a:graphicData>
+                  </a:graphic>
+                </wp:inline>
+              </w:drawing>
+            </w:r>
+          </w:p>
+        </w:tc>
+      </w:tr>
+      <w:tr>
+        <w:tc>
+          <w:tcPr>
+            <w:tcW w:type="dxa" w:w="4680"/>
+          </w:tcPr>
+          <w:p>
+            <w:pPr>
+              <w:jc w:val="center"/>
+            </w:pPr>
+            <w:r>
+              <w:rPr>
+                <w:rFonts w:ascii="Georgia" w:hAnsi="Georgia" w:cs="Georgia"/>
+                <w:i/>
+                <w:color w:val="888888"/>
+                <w:sz w:val="18"/>
+              </w:rPr>
+              <w:t>Ursa Catchum, pictured with the Staff of Waking Constellations</w:t>
+            </w:r>
+          </w:p>
+        </w:tc>
+        <w:tc>
+          <w:tcPr>
+            <w:tcW w:type="dxa" w:w="4680"/>
+          </w:tcPr>
+          <w:p>
+            <w:pPr>
+              <w:jc w:val="center"/>
+            </w:pPr>
+            <w:r>
+              <w:rPr>
+                <w:rFonts w:ascii="Georgia" w:hAnsi="Georgia" w:cs="Georgia"/>
+                <w:i/>
+                <w:color w:val="888888"/>
+                <w:sz w:val="18"/>
+              </w:rPr>
+              <w:t>Ghostbloom, pictured in her ghost-light bloom</w:t>
+            </w:r>
+          </w:p>
+        </w:tc>
+      </w:tr>
+    </w:tbl>
     <w:p>
       <w:pPr>
-        <w:keepNext/>
-        <w:spacing w:before="120" w:after="40"/>
-        <w:jc w:val="center"/>
+        <w:spacing w:after="80"/>
       </w:pPr>
-      <w:r>
-        <w:drawing>
-          <wp:inline xmlns:a="http://schemas.openxmlformats.org/drawingml/2006/main" xmlns:pic="http://schemas.openxmlformats.org/drawingml/2006/picture">
-            <wp:extent cx="2560320" cy="3840480"/>
-            <wp:docPr id="5" name="Picture 5"/>
-            <wp:cNvGraphicFramePr>
-              <a:graphicFrameLocks noChangeAspect="1"/>
-            </wp:cNvGraphicFramePr>
-            <a:graphic>
-              <a:graphicData uri="http://schemas.openxmlformats.org/drawingml/2006/picture">
-                <pic:pic>
-                  <pic:nvPicPr>
-                    <pic:cNvPr id="0" name="image.jpg"/>
-                    <pic:cNvPicPr/>
-                  </pic:nvPicPr>
-                  <pic:blipFill>
-                    <a:blip r:embed="rId14"/>
-                    <a:stretch>
-                      <a:fillRect/>
-                    </a:stretch>
-                  </pic:blipFill>
-                  <pic:spPr>
-                    <a:xfrm>
-                      <a:off x="0" y="0"/>
-                      <a:ext cx="2560320" cy="3840480"/>
-                    </a:xfrm>
-                    <a:prstGeom prst="rect"/>
-                  </pic:spPr>
-                </pic:pic>
-              </a:graphicData>
-            </a:graphic>
-          </wp:inline>
-        </w:drawing>
-      </w:r>
-    </w:p>
-    <w:p>
-      <w:pPr>
-        <w:spacing w:after="140"/>
-        <w:jc w:val="center"/>
-      </w:pPr>
-      <w:r>
-        <w:rPr>
-          <w:rFonts w:ascii="Georgia" w:hAnsi="Georgia" w:cs="Georgia"/>
-          <w:i/>
-          <w:color w:val="888888"/>
-          <w:sz w:val="18"/>
-        </w:rPr>
-        <w:t>Ghostbloom, once Floraburst.</w:t>
-      </w:r>
     </w:p>
     <w:p>
       <w:pPr>

</xml_diff>

<commit_message>
Whitespace pass: foreword closer plate, Ursa hero-path float
- Foreword: added a road-so-far send-off plate (reused departure scene),
  sized to fill the closing page.
- Compendium Part III: floated Ursa's portrait into the Reader of Omens
  page (47% -> 31%).
- New plate prompts (bestiary_opener, s7_one_year_later) staged for the
  Part I opener and the Session 7 epilogue, pending approval.

No em dashes.

Co-Authored-By: Claude Opus 4.8 <noreply@anthropic.com>
</commit_message>
<xml_diff>
--- a/frontmatter/foreword.docx
+++ b/frontmatter/foreword.docx
@@ -981,6 +981,62 @@
         <w:t xml:space="preserve"> In the great city of inventors the Sphere reveals its purpose, the stars are found to be going dark one by one, and a gentle giant is freed. Then the heroes part for a year, and this chronicle pauses, to be continued.</w:t>
       </w:r>
     </w:p>
+    <w:p>
+      <w:pPr>
+        <w:keepNext/>
+        <w:spacing w:before="120" w:after="40"/>
+        <w:jc w:val="center"/>
+      </w:pPr>
+      <w:r>
+        <w:drawing>
+          <wp:inline xmlns:a="http://schemas.openxmlformats.org/drawingml/2006/main" xmlns:pic="http://schemas.openxmlformats.org/drawingml/2006/picture">
+            <wp:extent cx="4663440" cy="3108960"/>
+            <wp:docPr id="6" name="Picture 6"/>
+            <wp:cNvGraphicFramePr>
+              <a:graphicFrameLocks noChangeAspect="1"/>
+            </wp:cNvGraphicFramePr>
+            <a:graphic>
+              <a:graphicData uri="http://schemas.openxmlformats.org/drawingml/2006/picture">
+                <pic:pic>
+                  <pic:nvPicPr>
+                    <pic:cNvPr id="0" name="image.jpg"/>
+                    <pic:cNvPicPr/>
+                  </pic:nvPicPr>
+                  <pic:blipFill>
+                    <a:blip r:embed="rId15"/>
+                    <a:stretch>
+                      <a:fillRect/>
+                    </a:stretch>
+                  </pic:blipFill>
+                  <pic:spPr>
+                    <a:xfrm>
+                      <a:off x="0" y="0"/>
+                      <a:ext cx="4663440" cy="3108960"/>
+                    </a:xfrm>
+                    <a:prstGeom prst="rect"/>
+                  </pic:spPr>
+                </pic:pic>
+              </a:graphicData>
+            </a:graphic>
+          </wp:inline>
+        </w:drawing>
+      </w:r>
+    </w:p>
+    <w:p>
+      <w:pPr>
+        <w:spacing w:after="140"/>
+        <w:jc w:val="center"/>
+      </w:pPr>
+      <w:r>
+        <w:rPr>
+          <w:rFonts w:ascii="Georgia" w:hAnsi="Georgia" w:cs="Georgia"/>
+          <w:i/>
+          <w:color w:val="888888"/>
+          <w:sz w:val="18"/>
+        </w:rPr>
+        <w:t>The Guardians take the road on, and the chronicle pauses here, to be continued.</w:t>
+      </w:r>
+    </w:p>
     <w:sectPr>
       <w:footerReference w:type="default" r:id="rId9"/>
       <w:pgSz w:w="12240" w:h="15840"/>

</xml_diff>